<commit_message>
major refactor: inroduced context and templates into the processing flow, split the code into logical files, and improved code organization
</commit_message>
<xml_diff>
--- a/templates/FND.docx
+++ b/templates/FND.docx
@@ -401,7 +401,6 @@
           <w:ilvl w:val="0"/>
           <w:numId w:val="2"/>
         </w:numPr>
-        <w:pBdr/>
         <w:spacing w:lineRule="auto" w:line="276" w:before="200" w:after="200"/>
         <w:rPr>
           <w:color w:val="000000"/>
@@ -435,12 +434,12 @@
         <w:tblLook w:noHBand="0" w:noVBand="1" w:firstColumn="0" w:lastRow="0" w:lastColumn="0" w:firstRow="0" w:val="0400"/>
       </w:tblPr>
       <w:tblGrid>
-        <w:gridCol w:w="845"/>
+        <w:gridCol w:w="843"/>
         <w:gridCol w:w="2268"/>
         <w:gridCol w:w="2268"/>
         <w:gridCol w:w="1843"/>
         <w:gridCol w:w="1134"/>
-        <w:gridCol w:w="1477"/>
+        <w:gridCol w:w="1479"/>
       </w:tblGrid>
       <w:tr>
         <w:trPr>
@@ -448,7 +447,7 @@
         </w:trPr>
         <w:tc>
           <w:tcPr>
-            <w:tcW w:w="845" w:type="dxa"/>
+            <w:tcW w:w="843" w:type="dxa"/>
             <w:tcBorders>
               <w:top w:val="single" w:sz="4" w:space="0" w:color="000000"/>
               <w:start w:val="single" w:sz="4" w:space="0" w:color="000000"/>
@@ -664,7 +663,7 @@
         </w:tc>
         <w:tc>
           <w:tcPr>
-            <w:tcW w:w="1477" w:type="dxa"/>
+            <w:tcW w:w="1479" w:type="dxa"/>
             <w:tcBorders>
               <w:top w:val="single" w:sz="4" w:space="0" w:color="000000"/>
               <w:start w:val="single" w:sz="4" w:space="0" w:color="000000"/>
@@ -717,7 +716,7 @@
         </w:trPr>
         <w:tc>
           <w:tcPr>
-            <w:tcW w:w="845" w:type="dxa"/>
+            <w:tcW w:w="843" w:type="dxa"/>
             <w:tcBorders>
               <w:top w:val="single" w:sz="4" w:space="0" w:color="000000"/>
               <w:start w:val="single" w:sz="4" w:space="0" w:color="000000"/>
@@ -871,7 +870,7 @@
         </w:tc>
         <w:tc>
           <w:tcPr>
-            <w:tcW w:w="1477" w:type="dxa"/>
+            <w:tcW w:w="1479" w:type="dxa"/>
             <w:tcBorders>
               <w:top w:val="single" w:sz="4" w:space="0" w:color="000000"/>
               <w:start w:val="single" w:sz="4" w:space="0" w:color="000000"/>
@@ -906,7 +905,7 @@
         </w:trPr>
         <w:tc>
           <w:tcPr>
-            <w:tcW w:w="845" w:type="dxa"/>
+            <w:tcW w:w="843" w:type="dxa"/>
             <w:tcBorders>
               <w:top w:val="single" w:sz="4" w:space="0" w:color="000000"/>
               <w:start w:val="single" w:sz="4" w:space="0" w:color="000000"/>
@@ -1061,7 +1060,7 @@
         </w:tc>
         <w:tc>
           <w:tcPr>
-            <w:tcW w:w="1477" w:type="dxa"/>
+            <w:tcW w:w="1479" w:type="dxa"/>
             <w:tcBorders>
               <w:top w:val="single" w:sz="4" w:space="0" w:color="000000"/>
               <w:start w:val="single" w:sz="4" w:space="0" w:color="000000"/>
@@ -1096,7 +1095,7 @@
         </w:trPr>
         <w:tc>
           <w:tcPr>
-            <w:tcW w:w="845" w:type="dxa"/>
+            <w:tcW w:w="843" w:type="dxa"/>
             <w:tcBorders>
               <w:top w:val="single" w:sz="4" w:space="0" w:color="000000"/>
               <w:start w:val="single" w:sz="4" w:space="0" w:color="000000"/>
@@ -1250,7 +1249,7 @@
         </w:tc>
         <w:tc>
           <w:tcPr>
-            <w:tcW w:w="1477" w:type="dxa"/>
+            <w:tcW w:w="1479" w:type="dxa"/>
             <w:tcBorders>
               <w:top w:val="single" w:sz="4" w:space="0" w:color="000000"/>
               <w:start w:val="single" w:sz="4" w:space="0" w:color="000000"/>
@@ -1322,7 +1321,7 @@
         </w:trPr>
         <w:tc>
           <w:tcPr>
-            <w:tcW w:w="845" w:type="dxa"/>
+            <w:tcW w:w="843" w:type="dxa"/>
             <w:tcBorders>
               <w:top w:val="single" w:sz="4" w:space="0" w:color="000000"/>
               <w:start w:val="single" w:sz="4" w:space="0" w:color="000000"/>
@@ -1476,7 +1475,7 @@
         </w:tc>
         <w:tc>
           <w:tcPr>
-            <w:tcW w:w="1477" w:type="dxa"/>
+            <w:tcW w:w="1479" w:type="dxa"/>
             <w:tcBorders>
               <w:top w:val="single" w:sz="4" w:space="0" w:color="000000"/>
               <w:start w:val="single" w:sz="4" w:space="0" w:color="000000"/>
@@ -1513,7 +1512,6 @@
           <w:ilvl w:val="0"/>
           <w:numId w:val="2"/>
         </w:numPr>
-        <w:pBdr/>
         <w:spacing w:lineRule="auto" w:line="276" w:before="200" w:after="200"/>
         <w:rPr>
           <w:b/>
@@ -1547,12 +1545,12 @@
         <w:tblLook w:noHBand="0" w:noVBand="1" w:firstColumn="0" w:lastRow="0" w:lastColumn="0" w:firstRow="0" w:val="0400"/>
       </w:tblPr>
       <w:tblGrid>
-        <w:gridCol w:w="845"/>
+        <w:gridCol w:w="843"/>
         <w:gridCol w:w="2268"/>
         <w:gridCol w:w="2268"/>
         <w:gridCol w:w="1843"/>
         <w:gridCol w:w="1134"/>
-        <w:gridCol w:w="1477"/>
+        <w:gridCol w:w="1479"/>
       </w:tblGrid>
       <w:tr>
         <w:trPr>
@@ -1560,7 +1558,7 @@
         </w:trPr>
         <w:tc>
           <w:tcPr>
-            <w:tcW w:w="845" w:type="dxa"/>
+            <w:tcW w:w="843" w:type="dxa"/>
             <w:tcBorders>
               <w:top w:val="single" w:sz="4" w:space="0" w:color="000000"/>
               <w:start w:val="single" w:sz="4" w:space="0" w:color="000000"/>
@@ -1776,7 +1774,7 @@
         </w:tc>
         <w:tc>
           <w:tcPr>
-            <w:tcW w:w="1477" w:type="dxa"/>
+            <w:tcW w:w="1479" w:type="dxa"/>
             <w:tcBorders>
               <w:top w:val="single" w:sz="4" w:space="0" w:color="000000"/>
               <w:start w:val="single" w:sz="4" w:space="0" w:color="000000"/>
@@ -1829,7 +1827,7 @@
         </w:trPr>
         <w:tc>
           <w:tcPr>
-            <w:tcW w:w="845" w:type="dxa"/>
+            <w:tcW w:w="843" w:type="dxa"/>
             <w:tcBorders>
               <w:top w:val="single" w:sz="4" w:space="0" w:color="000000"/>
               <w:start w:val="single" w:sz="4" w:space="0" w:color="000000"/>
@@ -1983,7 +1981,7 @@
         </w:tc>
         <w:tc>
           <w:tcPr>
-            <w:tcW w:w="1477" w:type="dxa"/>
+            <w:tcW w:w="1479" w:type="dxa"/>
             <w:tcBorders>
               <w:top w:val="single" w:sz="4" w:space="0" w:color="000000"/>
               <w:start w:val="single" w:sz="4" w:space="0" w:color="000000"/>
@@ -2018,7 +2016,7 @@
         </w:trPr>
         <w:tc>
           <w:tcPr>
-            <w:tcW w:w="845" w:type="dxa"/>
+            <w:tcW w:w="843" w:type="dxa"/>
             <w:tcBorders>
               <w:top w:val="single" w:sz="4" w:space="0" w:color="000000"/>
               <w:start w:val="single" w:sz="4" w:space="0" w:color="000000"/>
@@ -2173,7 +2171,7 @@
         </w:tc>
         <w:tc>
           <w:tcPr>
-            <w:tcW w:w="1477" w:type="dxa"/>
+            <w:tcW w:w="1479" w:type="dxa"/>
             <w:tcBorders>
               <w:top w:val="single" w:sz="4" w:space="0" w:color="000000"/>
               <w:start w:val="single" w:sz="4" w:space="0" w:color="000000"/>
@@ -2208,7 +2206,7 @@
         </w:trPr>
         <w:tc>
           <w:tcPr>
-            <w:tcW w:w="845" w:type="dxa"/>
+            <w:tcW w:w="843" w:type="dxa"/>
             <w:tcBorders>
               <w:top w:val="single" w:sz="4" w:space="0" w:color="000000"/>
               <w:start w:val="single" w:sz="4" w:space="0" w:color="000000"/>
@@ -2362,7 +2360,7 @@
         </w:tc>
         <w:tc>
           <w:tcPr>
-            <w:tcW w:w="1477" w:type="dxa"/>
+            <w:tcW w:w="1479" w:type="dxa"/>
             <w:tcBorders>
               <w:top w:val="single" w:sz="4" w:space="0" w:color="000000"/>
               <w:start w:val="single" w:sz="4" w:space="0" w:color="000000"/>
@@ -2434,7 +2432,7 @@
         </w:trPr>
         <w:tc>
           <w:tcPr>
-            <w:tcW w:w="845" w:type="dxa"/>
+            <w:tcW w:w="843" w:type="dxa"/>
             <w:tcBorders>
               <w:top w:val="single" w:sz="4" w:space="0" w:color="000000"/>
               <w:start w:val="single" w:sz="4" w:space="0" w:color="000000"/>
@@ -2588,7 +2586,7 @@
         </w:tc>
         <w:tc>
           <w:tcPr>
-            <w:tcW w:w="1477" w:type="dxa"/>
+            <w:tcW w:w="1479" w:type="dxa"/>
             <w:tcBorders>
               <w:top w:val="single" w:sz="4" w:space="0" w:color="000000"/>
               <w:start w:val="single" w:sz="4" w:space="0" w:color="000000"/>
@@ -2625,7 +2623,6 @@
           <w:ilvl w:val="0"/>
           <w:numId w:val="2"/>
         </w:numPr>
-        <w:pBdr/>
         <w:spacing w:lineRule="auto" w:line="276" w:before="200" w:after="200"/>
         <w:rPr>
           <w:b/>
@@ -2660,12 +2657,12 @@
         <w:tblLook w:noHBand="0" w:noVBand="1" w:firstColumn="0" w:lastRow="0" w:lastColumn="0" w:firstRow="0" w:val="0400"/>
       </w:tblPr>
       <w:tblGrid>
-        <w:gridCol w:w="845"/>
+        <w:gridCol w:w="843"/>
         <w:gridCol w:w="2268"/>
         <w:gridCol w:w="2268"/>
         <w:gridCol w:w="1843"/>
         <w:gridCol w:w="1134"/>
-        <w:gridCol w:w="1477"/>
+        <w:gridCol w:w="1479"/>
       </w:tblGrid>
       <w:tr>
         <w:trPr>
@@ -2673,7 +2670,7 @@
         </w:trPr>
         <w:tc>
           <w:tcPr>
-            <w:tcW w:w="845" w:type="dxa"/>
+            <w:tcW w:w="843" w:type="dxa"/>
             <w:tcBorders>
               <w:top w:val="single" w:sz="4" w:space="0" w:color="000000"/>
               <w:start w:val="single" w:sz="4" w:space="0" w:color="000000"/>
@@ -2889,7 +2886,7 @@
         </w:tc>
         <w:tc>
           <w:tcPr>
-            <w:tcW w:w="1477" w:type="dxa"/>
+            <w:tcW w:w="1479" w:type="dxa"/>
             <w:tcBorders>
               <w:top w:val="single" w:sz="4" w:space="0" w:color="000000"/>
               <w:start w:val="single" w:sz="4" w:space="0" w:color="000000"/>
@@ -2942,7 +2939,7 @@
         </w:trPr>
         <w:tc>
           <w:tcPr>
-            <w:tcW w:w="845" w:type="dxa"/>
+            <w:tcW w:w="843" w:type="dxa"/>
             <w:tcBorders>
               <w:top w:val="single" w:sz="4" w:space="0" w:color="000000"/>
               <w:start w:val="single" w:sz="4" w:space="0" w:color="000000"/>
@@ -3096,7 +3093,7 @@
         </w:tc>
         <w:tc>
           <w:tcPr>
-            <w:tcW w:w="1477" w:type="dxa"/>
+            <w:tcW w:w="1479" w:type="dxa"/>
             <w:tcBorders>
               <w:top w:val="single" w:sz="4" w:space="0" w:color="000000"/>
               <w:start w:val="single" w:sz="4" w:space="0" w:color="000000"/>
@@ -3131,7 +3128,7 @@
         </w:trPr>
         <w:tc>
           <w:tcPr>
-            <w:tcW w:w="845" w:type="dxa"/>
+            <w:tcW w:w="843" w:type="dxa"/>
             <w:tcBorders>
               <w:top w:val="single" w:sz="4" w:space="0" w:color="000000"/>
               <w:start w:val="single" w:sz="4" w:space="0" w:color="000000"/>
@@ -3286,7 +3283,7 @@
         </w:tc>
         <w:tc>
           <w:tcPr>
-            <w:tcW w:w="1477" w:type="dxa"/>
+            <w:tcW w:w="1479" w:type="dxa"/>
             <w:tcBorders>
               <w:top w:val="single" w:sz="4" w:space="0" w:color="000000"/>
               <w:start w:val="single" w:sz="4" w:space="0" w:color="000000"/>
@@ -3321,7 +3318,7 @@
         </w:trPr>
         <w:tc>
           <w:tcPr>
-            <w:tcW w:w="845" w:type="dxa"/>
+            <w:tcW w:w="843" w:type="dxa"/>
             <w:tcBorders>
               <w:top w:val="single" w:sz="4" w:space="0" w:color="000000"/>
               <w:start w:val="single" w:sz="4" w:space="0" w:color="000000"/>
@@ -3475,7 +3472,7 @@
         </w:tc>
         <w:tc>
           <w:tcPr>
-            <w:tcW w:w="1477" w:type="dxa"/>
+            <w:tcW w:w="1479" w:type="dxa"/>
             <w:tcBorders>
               <w:top w:val="single" w:sz="4" w:space="0" w:color="000000"/>
               <w:start w:val="single" w:sz="4" w:space="0" w:color="000000"/>
@@ -3547,7 +3544,7 @@
         </w:trPr>
         <w:tc>
           <w:tcPr>
-            <w:tcW w:w="845" w:type="dxa"/>
+            <w:tcW w:w="843" w:type="dxa"/>
             <w:tcBorders>
               <w:top w:val="single" w:sz="4" w:space="0" w:color="000000"/>
               <w:start w:val="single" w:sz="4" w:space="0" w:color="000000"/>
@@ -3701,7 +3698,7 @@
         </w:tc>
         <w:tc>
           <w:tcPr>
-            <w:tcW w:w="1477" w:type="dxa"/>
+            <w:tcW w:w="1479" w:type="dxa"/>
             <w:tcBorders>
               <w:top w:val="single" w:sz="4" w:space="0" w:color="000000"/>
               <w:start w:val="single" w:sz="4" w:space="0" w:color="000000"/>
@@ -3739,7 +3736,6 @@
           <w:ilvl w:val="0"/>
           <w:numId w:val="2"/>
         </w:numPr>
-        <w:pBdr/>
         <w:spacing w:before="200" w:after="200"/>
         <w:rPr>
           <w:color w:val="000000"/>
@@ -3775,8 +3771,8 @@
         <w:gridCol w:w="1830"/>
         <w:gridCol w:w="2820"/>
         <w:gridCol w:w="2460"/>
-        <w:gridCol w:w="869"/>
-        <w:gridCol w:w="1846"/>
+        <w:gridCol w:w="867"/>
+        <w:gridCol w:w="1848"/>
       </w:tblGrid>
       <w:tr>
         <w:trPr>
@@ -3877,7 +3873,7 @@
         </w:tc>
         <w:tc>
           <w:tcPr>
-            <w:tcW w:w="869" w:type="dxa"/>
+            <w:tcW w:w="867" w:type="dxa"/>
             <w:tcBorders>
               <w:top w:val="single" w:sz="4" w:space="0" w:color="000000"/>
               <w:start w:val="single" w:sz="4" w:space="0" w:color="000000"/>
@@ -3908,7 +3904,7 @@
         </w:tc>
         <w:tc>
           <w:tcPr>
-            <w:tcW w:w="1846" w:type="dxa"/>
+            <w:tcW w:w="1848" w:type="dxa"/>
             <w:tcBorders>
               <w:top w:val="single" w:sz="4" w:space="0" w:color="000000"/>
               <w:start w:val="single" w:sz="4" w:space="0" w:color="000000"/>
@@ -4034,37 +4030,37 @@
         </w:tc>
         <w:tc>
           <w:tcPr>
-            <w:tcW w:w="869" w:type="dxa"/>
-            <w:tcBorders>
-              <w:top w:val="single" w:sz="4" w:space="0" w:color="000000"/>
-              <w:start w:val="single" w:sz="4" w:space="0" w:color="000000"/>
-              <w:bottom w:val="single" w:sz="4" w:space="0" w:color="000000"/>
-              <w:end w:val="single" w:sz="4" w:space="0" w:color="000000"/>
-            </w:tcBorders>
-            <w:vAlign w:val="center"/>
-          </w:tcPr>
-          <w:p>
-            <w:pPr>
-              <w:pStyle w:val="Normal"/>
-              <w:jc w:val="center"/>
-              <w:rPr>
-                <w:b/>
-                <w:sz w:val="22"/>
-                <w:szCs w:val="22"/>
-              </w:rPr>
-            </w:pPr>
-            <w:r>
-              <w:rPr>
-                <w:b/>
-                <w:sz w:val="22"/>
-                <w:szCs w:val="22"/>
-              </w:rPr>
-            </w:r>
-          </w:p>
-        </w:tc>
-        <w:tc>
-          <w:tcPr>
-            <w:tcW w:w="1846" w:type="dxa"/>
+            <w:tcW w:w="867" w:type="dxa"/>
+            <w:tcBorders>
+              <w:top w:val="single" w:sz="4" w:space="0" w:color="000000"/>
+              <w:start w:val="single" w:sz="4" w:space="0" w:color="000000"/>
+              <w:bottom w:val="single" w:sz="4" w:space="0" w:color="000000"/>
+              <w:end w:val="single" w:sz="4" w:space="0" w:color="000000"/>
+            </w:tcBorders>
+            <w:vAlign w:val="center"/>
+          </w:tcPr>
+          <w:p>
+            <w:pPr>
+              <w:pStyle w:val="Normal"/>
+              <w:jc w:val="center"/>
+              <w:rPr>
+                <w:b/>
+                <w:sz w:val="22"/>
+                <w:szCs w:val="22"/>
+              </w:rPr>
+            </w:pPr>
+            <w:r>
+              <w:rPr>
+                <w:b/>
+                <w:sz w:val="22"/>
+                <w:szCs w:val="22"/>
+              </w:rPr>
+            </w:r>
+          </w:p>
+        </w:tc>
+        <w:tc>
+          <w:tcPr>
+            <w:tcW w:w="1848" w:type="dxa"/>
             <w:tcBorders>
               <w:top w:val="single" w:sz="4" w:space="0" w:color="000000"/>
               <w:start w:val="single" w:sz="4" w:space="0" w:color="000000"/>
@@ -4189,7 +4185,7 @@
         </w:tc>
         <w:tc>
           <w:tcPr>
-            <w:tcW w:w="869" w:type="dxa"/>
+            <w:tcW w:w="867" w:type="dxa"/>
             <w:tcBorders>
               <w:top w:val="single" w:sz="4" w:space="0" w:color="000000"/>
               <w:start w:val="single" w:sz="4" w:space="0" w:color="000000"/>
@@ -4219,7 +4215,7 @@
         </w:tc>
         <w:tc>
           <w:tcPr>
-            <w:tcW w:w="1846" w:type="dxa"/>
+            <w:tcW w:w="1848" w:type="dxa"/>
             <w:tcBorders>
               <w:top w:val="single" w:sz="4" w:space="0" w:color="000000"/>
               <w:start w:val="single" w:sz="4" w:space="0" w:color="000000"/>
@@ -4344,37 +4340,37 @@
         </w:tc>
         <w:tc>
           <w:tcPr>
-            <w:tcW w:w="869" w:type="dxa"/>
-            <w:tcBorders>
-              <w:top w:val="single" w:sz="4" w:space="0" w:color="000000"/>
-              <w:start w:val="single" w:sz="4" w:space="0" w:color="000000"/>
-              <w:bottom w:val="single" w:sz="4" w:space="0" w:color="000000"/>
-              <w:end w:val="single" w:sz="4" w:space="0" w:color="000000"/>
-            </w:tcBorders>
-            <w:vAlign w:val="center"/>
-          </w:tcPr>
-          <w:p>
-            <w:pPr>
-              <w:pStyle w:val="Normal"/>
-              <w:jc w:val="center"/>
-              <w:rPr>
-                <w:b/>
-                <w:sz w:val="22"/>
-                <w:szCs w:val="22"/>
-              </w:rPr>
-            </w:pPr>
-            <w:r>
-              <w:rPr>
-                <w:b/>
-                <w:sz w:val="22"/>
-                <w:szCs w:val="22"/>
-              </w:rPr>
-            </w:r>
-          </w:p>
-        </w:tc>
-        <w:tc>
-          <w:tcPr>
-            <w:tcW w:w="1846" w:type="dxa"/>
+            <w:tcW w:w="867" w:type="dxa"/>
+            <w:tcBorders>
+              <w:top w:val="single" w:sz="4" w:space="0" w:color="000000"/>
+              <w:start w:val="single" w:sz="4" w:space="0" w:color="000000"/>
+              <w:bottom w:val="single" w:sz="4" w:space="0" w:color="000000"/>
+              <w:end w:val="single" w:sz="4" w:space="0" w:color="000000"/>
+            </w:tcBorders>
+            <w:vAlign w:val="center"/>
+          </w:tcPr>
+          <w:p>
+            <w:pPr>
+              <w:pStyle w:val="Normal"/>
+              <w:jc w:val="center"/>
+              <w:rPr>
+                <w:b/>
+                <w:sz w:val="22"/>
+                <w:szCs w:val="22"/>
+              </w:rPr>
+            </w:pPr>
+            <w:r>
+              <w:rPr>
+                <w:b/>
+                <w:sz w:val="22"/>
+                <w:szCs w:val="22"/>
+              </w:rPr>
+            </w:r>
+          </w:p>
+        </w:tc>
+        <w:tc>
+          <w:tcPr>
+            <w:tcW w:w="1848" w:type="dxa"/>
             <w:tcBorders>
               <w:top w:val="single" w:sz="4" w:space="0" w:color="000000"/>
               <w:start w:val="single" w:sz="4" w:space="0" w:color="000000"/>
@@ -4529,37 +4525,37 @@
         </w:tc>
         <w:tc>
           <w:tcPr>
-            <w:tcW w:w="869" w:type="dxa"/>
-            <w:tcBorders>
-              <w:top w:val="single" w:sz="4" w:space="0" w:color="000000"/>
-              <w:start w:val="single" w:sz="4" w:space="0" w:color="000000"/>
-              <w:bottom w:val="single" w:sz="4" w:space="0" w:color="000000"/>
-              <w:end w:val="single" w:sz="4" w:space="0" w:color="000000"/>
-            </w:tcBorders>
-            <w:vAlign w:val="center"/>
-          </w:tcPr>
-          <w:p>
-            <w:pPr>
-              <w:pStyle w:val="Normal"/>
-              <w:jc w:val="center"/>
-              <w:rPr>
-                <w:b/>
-                <w:sz w:val="22"/>
-                <w:szCs w:val="22"/>
-              </w:rPr>
-            </w:pPr>
-            <w:r>
-              <w:rPr>
-                <w:b/>
-                <w:sz w:val="22"/>
-                <w:szCs w:val="22"/>
-              </w:rPr>
-            </w:r>
-          </w:p>
-        </w:tc>
-        <w:tc>
-          <w:tcPr>
-            <w:tcW w:w="1846" w:type="dxa"/>
+            <w:tcW w:w="867" w:type="dxa"/>
+            <w:tcBorders>
+              <w:top w:val="single" w:sz="4" w:space="0" w:color="000000"/>
+              <w:start w:val="single" w:sz="4" w:space="0" w:color="000000"/>
+              <w:bottom w:val="single" w:sz="4" w:space="0" w:color="000000"/>
+              <w:end w:val="single" w:sz="4" w:space="0" w:color="000000"/>
+            </w:tcBorders>
+            <w:vAlign w:val="center"/>
+          </w:tcPr>
+          <w:p>
+            <w:pPr>
+              <w:pStyle w:val="Normal"/>
+              <w:jc w:val="center"/>
+              <w:rPr>
+                <w:b/>
+                <w:sz w:val="22"/>
+                <w:szCs w:val="22"/>
+              </w:rPr>
+            </w:pPr>
+            <w:r>
+              <w:rPr>
+                <w:b/>
+                <w:sz w:val="22"/>
+                <w:szCs w:val="22"/>
+              </w:rPr>
+            </w:r>
+          </w:p>
+        </w:tc>
+        <w:tc>
+          <w:tcPr>
+            <w:tcW w:w="1848" w:type="dxa"/>
             <w:tcBorders>
               <w:top w:val="single" w:sz="4" w:space="0" w:color="000000"/>
               <w:start w:val="single" w:sz="4" w:space="0" w:color="000000"/>
@@ -4597,7 +4593,6 @@
           <w:ilvl w:val="0"/>
           <w:numId w:val="2"/>
         </w:numPr>
-        <w:pBdr/>
         <w:spacing w:before="200" w:after="200"/>
         <w:rPr>
           <w:color w:val="000000"/>
@@ -4631,29 +4626,28 @@
         <w:tblLook w:noHBand="0" w:noVBand="1" w:firstColumn="0" w:lastRow="0" w:lastColumn="0" w:firstRow="0" w:val="0400"/>
       </w:tblPr>
       <w:tblGrid>
-        <w:gridCol w:w="845"/>
+        <w:gridCol w:w="843"/>
         <w:gridCol w:w="2126"/>
         <w:gridCol w:w="1985"/>
-        <w:gridCol w:w="2552"/>
+        <w:gridCol w:w="2554"/>
         <w:gridCol w:w="2362"/>
       </w:tblGrid>
       <w:tr>
         <w:trPr/>
         <w:tc>
           <w:tcPr>
-            <w:tcW w:w="845" w:type="dxa"/>
-            <w:tcBorders>
-              <w:top w:val="single" w:sz="4" w:space="0" w:color="000000"/>
-              <w:start w:val="single" w:sz="4" w:space="0" w:color="000000"/>
-              <w:bottom w:val="single" w:sz="4" w:space="0" w:color="000000"/>
-              <w:end w:val="single" w:sz="4" w:space="0" w:color="000000"/>
-            </w:tcBorders>
-            <w:vAlign w:val="center"/>
-          </w:tcPr>
-          <w:p>
-            <w:pPr>
-              <w:pStyle w:val="Normal"/>
-              <w:pBdr/>
+            <w:tcW w:w="843" w:type="dxa"/>
+            <w:tcBorders>
+              <w:top w:val="single" w:sz="4" w:space="0" w:color="000000"/>
+              <w:start w:val="single" w:sz="4" w:space="0" w:color="000000"/>
+              <w:bottom w:val="single" w:sz="4" w:space="0" w:color="000000"/>
+              <w:end w:val="single" w:sz="4" w:space="0" w:color="000000"/>
+            </w:tcBorders>
+            <w:vAlign w:val="center"/>
+          </w:tcPr>
+          <w:p>
+            <w:pPr>
+              <w:pStyle w:val="Normal"/>
               <w:jc w:val="center"/>
               <w:rPr>
                 <w:b/>
@@ -4685,7 +4679,6 @@
           <w:p>
             <w:pPr>
               <w:pStyle w:val="Normal"/>
-              <w:pBdr/>
               <w:jc w:val="center"/>
               <w:rPr>
                 <w:b/>
@@ -4717,7 +4710,6 @@
           <w:p>
             <w:pPr>
               <w:pStyle w:val="Normal"/>
-              <w:pBdr/>
               <w:jc w:val="center"/>
               <w:rPr>
                 <w:b/>
@@ -4737,19 +4729,18 @@
         </w:tc>
         <w:tc>
           <w:tcPr>
-            <w:tcW w:w="2552" w:type="dxa"/>
-            <w:tcBorders>
-              <w:top w:val="single" w:sz="4" w:space="0" w:color="000000"/>
-              <w:start w:val="single" w:sz="4" w:space="0" w:color="000000"/>
-              <w:bottom w:val="single" w:sz="4" w:space="0" w:color="000000"/>
-              <w:end w:val="single" w:sz="4" w:space="0" w:color="000000"/>
-            </w:tcBorders>
-            <w:vAlign w:val="center"/>
-          </w:tcPr>
-          <w:p>
-            <w:pPr>
-              <w:pStyle w:val="Normal"/>
-              <w:pBdr/>
+            <w:tcW w:w="2554" w:type="dxa"/>
+            <w:tcBorders>
+              <w:top w:val="single" w:sz="4" w:space="0" w:color="000000"/>
+              <w:start w:val="single" w:sz="4" w:space="0" w:color="000000"/>
+              <w:bottom w:val="single" w:sz="4" w:space="0" w:color="000000"/>
+              <w:end w:val="single" w:sz="4" w:space="0" w:color="000000"/>
+            </w:tcBorders>
+            <w:vAlign w:val="center"/>
+          </w:tcPr>
+          <w:p>
+            <w:pPr>
+              <w:pStyle w:val="Normal"/>
               <w:jc w:val="center"/>
               <w:rPr>
                 <w:b/>
@@ -4796,7 +4787,6 @@
           <w:p>
             <w:pPr>
               <w:pStyle w:val="Normal"/>
-              <w:pBdr/>
               <w:jc w:val="center"/>
               <w:rPr>
                 <w:b/>
@@ -4815,19 +4805,18 @@
         <w:trPr/>
         <w:tc>
           <w:tcPr>
-            <w:tcW w:w="845" w:type="dxa"/>
-            <w:tcBorders>
-              <w:top w:val="single" w:sz="4" w:space="0" w:color="000000"/>
-              <w:start w:val="single" w:sz="4" w:space="0" w:color="000000"/>
-              <w:bottom w:val="single" w:sz="4" w:space="0" w:color="000000"/>
-              <w:end w:val="single" w:sz="4" w:space="0" w:color="000000"/>
-            </w:tcBorders>
-            <w:vAlign w:val="center"/>
-          </w:tcPr>
-          <w:p>
-            <w:pPr>
-              <w:pStyle w:val="Normal"/>
-              <w:pBdr/>
+            <w:tcW w:w="843" w:type="dxa"/>
+            <w:tcBorders>
+              <w:top w:val="single" w:sz="4" w:space="0" w:color="000000"/>
+              <w:start w:val="single" w:sz="4" w:space="0" w:color="000000"/>
+              <w:bottom w:val="single" w:sz="4" w:space="0" w:color="000000"/>
+              <w:end w:val="single" w:sz="4" w:space="0" w:color="000000"/>
+            </w:tcBorders>
+            <w:vAlign w:val="center"/>
+          </w:tcPr>
+          <w:p>
+            <w:pPr>
+              <w:pStyle w:val="Normal"/>
               <w:jc w:val="center"/>
               <w:rPr>
                 <w:b/>
@@ -4858,7 +4847,6 @@
           <w:p>
             <w:pPr>
               <w:pStyle w:val="Normal"/>
-              <w:pBdr/>
               <w:jc w:val="center"/>
               <w:rPr>
                 <w:b/>
@@ -4889,38 +4877,36 @@
           <w:p>
             <w:pPr>
               <w:pStyle w:val="Normal"/>
-              <w:pBdr/>
-              <w:jc w:val="center"/>
-              <w:rPr>
-                <w:b/>
-                <w:sz w:val="22"/>
-                <w:szCs w:val="22"/>
-              </w:rPr>
-            </w:pPr>
-            <w:r>
-              <w:rPr>
-                <w:b/>
-                <w:sz w:val="22"/>
-                <w:szCs w:val="22"/>
-              </w:rPr>
-            </w:r>
-          </w:p>
-        </w:tc>
-        <w:tc>
-          <w:tcPr>
-            <w:tcW w:w="2552" w:type="dxa"/>
-            <w:tcBorders>
-              <w:top w:val="single" w:sz="4" w:space="0" w:color="000000"/>
-              <w:start w:val="single" w:sz="4" w:space="0" w:color="000000"/>
-              <w:bottom w:val="single" w:sz="4" w:space="0" w:color="000000"/>
-              <w:end w:val="single" w:sz="4" w:space="0" w:color="000000"/>
-            </w:tcBorders>
-            <w:vAlign w:val="center"/>
-          </w:tcPr>
-          <w:p>
-            <w:pPr>
-              <w:pStyle w:val="Normal"/>
-              <w:pBdr/>
+              <w:jc w:val="center"/>
+              <w:rPr>
+                <w:b/>
+                <w:sz w:val="22"/>
+                <w:szCs w:val="22"/>
+              </w:rPr>
+            </w:pPr>
+            <w:r>
+              <w:rPr>
+                <w:b/>
+                <w:sz w:val="22"/>
+                <w:szCs w:val="22"/>
+              </w:rPr>
+            </w:r>
+          </w:p>
+        </w:tc>
+        <w:tc>
+          <w:tcPr>
+            <w:tcW w:w="2554" w:type="dxa"/>
+            <w:tcBorders>
+              <w:top w:val="single" w:sz="4" w:space="0" w:color="000000"/>
+              <w:start w:val="single" w:sz="4" w:space="0" w:color="000000"/>
+              <w:bottom w:val="single" w:sz="4" w:space="0" w:color="000000"/>
+              <w:end w:val="single" w:sz="4" w:space="0" w:color="000000"/>
+            </w:tcBorders>
+            <w:vAlign w:val="center"/>
+          </w:tcPr>
+          <w:p>
+            <w:pPr>
+              <w:pStyle w:val="Normal"/>
               <w:jc w:val="center"/>
               <w:rPr>
                 <w:b/>
@@ -4968,19 +4954,18 @@
         <w:trPr/>
         <w:tc>
           <w:tcPr>
-            <w:tcW w:w="845" w:type="dxa"/>
-            <w:tcBorders>
-              <w:top w:val="single" w:sz="4" w:space="0" w:color="000000"/>
-              <w:start w:val="single" w:sz="4" w:space="0" w:color="000000"/>
-              <w:bottom w:val="single" w:sz="4" w:space="0" w:color="000000"/>
-              <w:end w:val="single" w:sz="4" w:space="0" w:color="000000"/>
-            </w:tcBorders>
-            <w:vAlign w:val="center"/>
-          </w:tcPr>
-          <w:p>
-            <w:pPr>
-              <w:pStyle w:val="Normal"/>
-              <w:pBdr/>
+            <w:tcW w:w="843" w:type="dxa"/>
+            <w:tcBorders>
+              <w:top w:val="single" w:sz="4" w:space="0" w:color="000000"/>
+              <w:start w:val="single" w:sz="4" w:space="0" w:color="000000"/>
+              <w:bottom w:val="single" w:sz="4" w:space="0" w:color="000000"/>
+              <w:end w:val="single" w:sz="4" w:space="0" w:color="000000"/>
+            </w:tcBorders>
+            <w:vAlign w:val="center"/>
+          </w:tcPr>
+          <w:p>
+            <w:pPr>
+              <w:pStyle w:val="Normal"/>
               <w:jc w:val="center"/>
               <w:rPr>
                 <w:b/>
@@ -5012,7 +4997,6 @@
           <w:p>
             <w:pPr>
               <w:pStyle w:val="Normal"/>
-              <w:pBdr/>
               <w:jc w:val="center"/>
               <w:rPr>
                 <w:b/>
@@ -5043,7 +5027,6 @@
           <w:p>
             <w:pPr>
               <w:pStyle w:val="Normal"/>
-              <w:pBdr/>
               <w:jc w:val="center"/>
               <w:rPr>
                 <w:b/>
@@ -5062,19 +5045,18 @@
         </w:tc>
         <w:tc>
           <w:tcPr>
-            <w:tcW w:w="2552" w:type="dxa"/>
-            <w:tcBorders>
-              <w:top w:val="single" w:sz="4" w:space="0" w:color="000000"/>
-              <w:start w:val="single" w:sz="4" w:space="0" w:color="000000"/>
-              <w:bottom w:val="single" w:sz="4" w:space="0" w:color="000000"/>
-              <w:end w:val="single" w:sz="4" w:space="0" w:color="000000"/>
-            </w:tcBorders>
-            <w:vAlign w:val="center"/>
-          </w:tcPr>
-          <w:p>
-            <w:pPr>
-              <w:pStyle w:val="Normal"/>
-              <w:pBdr/>
+            <w:tcW w:w="2554" w:type="dxa"/>
+            <w:tcBorders>
+              <w:top w:val="single" w:sz="4" w:space="0" w:color="000000"/>
+              <w:start w:val="single" w:sz="4" w:space="0" w:color="000000"/>
+              <w:bottom w:val="single" w:sz="4" w:space="0" w:color="000000"/>
+              <w:end w:val="single" w:sz="4" w:space="0" w:color="000000"/>
+            </w:tcBorders>
+            <w:vAlign w:val="center"/>
+          </w:tcPr>
+          <w:p>
+            <w:pPr>
+              <w:pStyle w:val="Normal"/>
               <w:jc w:val="center"/>
               <w:rPr>
                 <w:b/>
@@ -5124,19 +5106,18 @@
         <w:trPr/>
         <w:tc>
           <w:tcPr>
-            <w:tcW w:w="845" w:type="dxa"/>
-            <w:tcBorders>
-              <w:top w:val="single" w:sz="4" w:space="0" w:color="000000"/>
-              <w:start w:val="single" w:sz="4" w:space="0" w:color="000000"/>
-              <w:bottom w:val="single" w:sz="4" w:space="0" w:color="000000"/>
-              <w:end w:val="single" w:sz="4" w:space="0" w:color="000000"/>
-            </w:tcBorders>
-            <w:vAlign w:val="center"/>
-          </w:tcPr>
-          <w:p>
-            <w:pPr>
-              <w:pStyle w:val="Normal"/>
-              <w:pBdr/>
+            <w:tcW w:w="843" w:type="dxa"/>
+            <w:tcBorders>
+              <w:top w:val="single" w:sz="4" w:space="0" w:color="000000"/>
+              <w:start w:val="single" w:sz="4" w:space="0" w:color="000000"/>
+              <w:bottom w:val="single" w:sz="4" w:space="0" w:color="000000"/>
+              <w:end w:val="single" w:sz="4" w:space="0" w:color="000000"/>
+            </w:tcBorders>
+            <w:vAlign w:val="center"/>
+          </w:tcPr>
+          <w:p>
+            <w:pPr>
+              <w:pStyle w:val="Normal"/>
               <w:jc w:val="center"/>
               <w:rPr>
                 <w:b/>
@@ -5167,7 +5148,6 @@
           <w:p>
             <w:pPr>
               <w:pStyle w:val="Normal"/>
-              <w:pBdr/>
               <w:jc w:val="center"/>
               <w:rPr>
                 <w:b/>
@@ -5198,38 +5178,36 @@
           <w:p>
             <w:pPr>
               <w:pStyle w:val="Normal"/>
-              <w:pBdr/>
-              <w:jc w:val="center"/>
-              <w:rPr>
-                <w:b/>
-                <w:sz w:val="22"/>
-                <w:szCs w:val="22"/>
-              </w:rPr>
-            </w:pPr>
-            <w:r>
-              <w:rPr>
-                <w:b/>
-                <w:sz w:val="22"/>
-                <w:szCs w:val="22"/>
-              </w:rPr>
-            </w:r>
-          </w:p>
-        </w:tc>
-        <w:tc>
-          <w:tcPr>
-            <w:tcW w:w="2552" w:type="dxa"/>
-            <w:tcBorders>
-              <w:top w:val="single" w:sz="4" w:space="0" w:color="000000"/>
-              <w:start w:val="single" w:sz="4" w:space="0" w:color="000000"/>
-              <w:bottom w:val="single" w:sz="4" w:space="0" w:color="000000"/>
-              <w:end w:val="single" w:sz="4" w:space="0" w:color="000000"/>
-            </w:tcBorders>
-            <w:vAlign w:val="center"/>
-          </w:tcPr>
-          <w:p>
-            <w:pPr>
-              <w:pStyle w:val="Normal"/>
-              <w:pBdr/>
+              <w:jc w:val="center"/>
+              <w:rPr>
+                <w:b/>
+                <w:sz w:val="22"/>
+                <w:szCs w:val="22"/>
+              </w:rPr>
+            </w:pPr>
+            <w:r>
+              <w:rPr>
+                <w:b/>
+                <w:sz w:val="22"/>
+                <w:szCs w:val="22"/>
+              </w:rPr>
+            </w:r>
+          </w:p>
+        </w:tc>
+        <w:tc>
+          <w:tcPr>
+            <w:tcW w:w="2554" w:type="dxa"/>
+            <w:tcBorders>
+              <w:top w:val="single" w:sz="4" w:space="0" w:color="000000"/>
+              <w:start w:val="single" w:sz="4" w:space="0" w:color="000000"/>
+              <w:bottom w:val="single" w:sz="4" w:space="0" w:color="000000"/>
+              <w:end w:val="single" w:sz="4" w:space="0" w:color="000000"/>
+            </w:tcBorders>
+            <w:vAlign w:val="center"/>
+          </w:tcPr>
+          <w:p>
+            <w:pPr>
+              <w:pStyle w:val="Normal"/>
               <w:jc w:val="center"/>
               <w:rPr>
                 <w:b/>
@@ -5310,19 +5288,18 @@
         <w:trPr/>
         <w:tc>
           <w:tcPr>
-            <w:tcW w:w="845" w:type="dxa"/>
-            <w:tcBorders>
-              <w:top w:val="single" w:sz="4" w:space="0" w:color="000000"/>
-              <w:start w:val="single" w:sz="4" w:space="0" w:color="000000"/>
-              <w:bottom w:val="single" w:sz="4" w:space="0" w:color="000000"/>
-              <w:end w:val="single" w:sz="4" w:space="0" w:color="000000"/>
-            </w:tcBorders>
-            <w:vAlign w:val="center"/>
-          </w:tcPr>
-          <w:p>
-            <w:pPr>
-              <w:pStyle w:val="Normal"/>
-              <w:pBdr/>
+            <w:tcW w:w="843" w:type="dxa"/>
+            <w:tcBorders>
+              <w:top w:val="single" w:sz="4" w:space="0" w:color="000000"/>
+              <w:start w:val="single" w:sz="4" w:space="0" w:color="000000"/>
+              <w:bottom w:val="single" w:sz="4" w:space="0" w:color="000000"/>
+              <w:end w:val="single" w:sz="4" w:space="0" w:color="000000"/>
+            </w:tcBorders>
+            <w:vAlign w:val="center"/>
+          </w:tcPr>
+          <w:p>
+            <w:pPr>
+              <w:pStyle w:val="Normal"/>
               <w:jc w:val="center"/>
               <w:rPr>
                 <w:b/>
@@ -5353,7 +5330,6 @@
           <w:p>
             <w:pPr>
               <w:pStyle w:val="Normal"/>
-              <w:pBdr/>
               <w:jc w:val="center"/>
               <w:rPr>
                 <w:b/>
@@ -5384,38 +5360,36 @@
           <w:p>
             <w:pPr>
               <w:pStyle w:val="Normal"/>
-              <w:pBdr/>
-              <w:jc w:val="center"/>
-              <w:rPr>
-                <w:b/>
-                <w:sz w:val="22"/>
-                <w:szCs w:val="22"/>
-              </w:rPr>
-            </w:pPr>
-            <w:r>
-              <w:rPr>
-                <w:b/>
-                <w:sz w:val="22"/>
-                <w:szCs w:val="22"/>
-              </w:rPr>
-            </w:r>
-          </w:p>
-        </w:tc>
-        <w:tc>
-          <w:tcPr>
-            <w:tcW w:w="2552" w:type="dxa"/>
-            <w:tcBorders>
-              <w:top w:val="single" w:sz="4" w:space="0" w:color="000000"/>
-              <w:start w:val="single" w:sz="4" w:space="0" w:color="000000"/>
-              <w:bottom w:val="single" w:sz="4" w:space="0" w:color="000000"/>
-              <w:end w:val="single" w:sz="4" w:space="0" w:color="000000"/>
-            </w:tcBorders>
-            <w:vAlign w:val="center"/>
-          </w:tcPr>
-          <w:p>
-            <w:pPr>
-              <w:pStyle w:val="Normal"/>
-              <w:pBdr/>
+              <w:jc w:val="center"/>
+              <w:rPr>
+                <w:b/>
+                <w:sz w:val="22"/>
+                <w:szCs w:val="22"/>
+              </w:rPr>
+            </w:pPr>
+            <w:r>
+              <w:rPr>
+                <w:b/>
+                <w:sz w:val="22"/>
+                <w:szCs w:val="22"/>
+              </w:rPr>
+            </w:r>
+          </w:p>
+        </w:tc>
+        <w:tc>
+          <w:tcPr>
+            <w:tcW w:w="2554" w:type="dxa"/>
+            <w:tcBorders>
+              <w:top w:val="single" w:sz="4" w:space="0" w:color="000000"/>
+              <w:start w:val="single" w:sz="4" w:space="0" w:color="000000"/>
+              <w:bottom w:val="single" w:sz="4" w:space="0" w:color="000000"/>
+              <w:end w:val="single" w:sz="4" w:space="0" w:color="000000"/>
+            </w:tcBorders>
+            <w:vAlign w:val="center"/>
+          </w:tcPr>
+          <w:p>
+            <w:pPr>
+              <w:pStyle w:val="Normal"/>
               <w:jc w:val="center"/>
               <w:rPr>
                 <w:b/>
@@ -5468,7 +5442,6 @@
           <w:ilvl w:val="0"/>
           <w:numId w:val="2"/>
         </w:numPr>
-        <w:pBdr/>
         <w:spacing w:before="200" w:after="200"/>
         <w:rPr>
           <w:color w:val="000000"/>
@@ -5504,8 +5477,8 @@
       <w:tblGrid>
         <w:gridCol w:w="1425"/>
         <w:gridCol w:w="2385"/>
-        <w:gridCol w:w="1844"/>
-        <w:gridCol w:w="1846"/>
+        <w:gridCol w:w="1842"/>
+        <w:gridCol w:w="1848"/>
         <w:gridCol w:w="2295"/>
       </w:tblGrid>
       <w:tr>
@@ -5527,7 +5500,6 @@
             <w:pPr>
               <w:pStyle w:val="Normal"/>
               <w:widowControl w:val="false"/>
-              <w:pBdr/>
               <w:jc w:val="center"/>
               <w:rPr>
                 <w:b/>
@@ -5562,7 +5534,6 @@
             <w:pPr>
               <w:pStyle w:val="Normal"/>
               <w:widowControl w:val="false"/>
-              <w:pBdr/>
               <w:spacing w:lineRule="auto" w:line="252"/>
               <w:jc w:val="center"/>
               <w:rPr>
@@ -5586,7 +5557,6 @@
             <w:pPr>
               <w:pStyle w:val="Normal"/>
               <w:widowControl w:val="false"/>
-              <w:pBdr/>
               <w:spacing w:lineRule="auto" w:line="252" w:before="5" w:after="0"/>
               <w:jc w:val="center"/>
               <w:rPr>
@@ -5609,7 +5579,7 @@
         </w:tc>
         <w:tc>
           <w:tcPr>
-            <w:tcW w:w="1844" w:type="dxa"/>
+            <w:tcW w:w="1842" w:type="dxa"/>
             <w:tcBorders>
               <w:top w:val="single" w:sz="4" w:space="0" w:color="000000"/>
               <w:start w:val="single" w:sz="4" w:space="0" w:color="000000"/>
@@ -5622,7 +5592,6 @@
             <w:pPr>
               <w:pStyle w:val="Normal"/>
               <w:widowControl w:val="false"/>
-              <w:pBdr/>
               <w:spacing w:before="125" w:after="0"/>
               <w:ind w:firstLine="16"/>
               <w:jc w:val="center"/>
@@ -5648,7 +5617,7 @@
         </w:tc>
         <w:tc>
           <w:tcPr>
-            <w:tcW w:w="1846" w:type="dxa"/>
+            <w:tcW w:w="1848" w:type="dxa"/>
             <w:tcBorders>
               <w:top w:val="single" w:sz="4" w:space="0" w:color="000000"/>
               <w:start w:val="single" w:sz="4" w:space="0" w:color="000000"/>
@@ -5661,7 +5630,6 @@
             <w:pPr>
               <w:pStyle w:val="Normal"/>
               <w:widowControl w:val="false"/>
-              <w:pBdr/>
               <w:spacing w:before="125" w:after="0"/>
               <w:jc w:val="center"/>
               <w:rPr>
@@ -5697,7 +5665,6 @@
             <w:pPr>
               <w:pStyle w:val="Normal"/>
               <w:widowControl w:val="false"/>
-              <w:pBdr/>
               <w:jc w:val="center"/>
               <w:rPr>
                 <w:b/>
@@ -5737,7 +5704,6 @@
             <w:pPr>
               <w:pStyle w:val="Normal"/>
               <w:widowControl w:val="false"/>
-              <w:pBdr/>
               <w:jc w:val="center"/>
               <w:rPr>
                 <w:b/>
@@ -5770,7 +5736,6 @@
             <w:pPr>
               <w:pStyle w:val="Normal"/>
               <w:widowControl w:val="false"/>
-              <w:pBdr/>
               <w:spacing w:lineRule="auto" w:line="252"/>
               <w:jc w:val="center"/>
               <w:rPr>
@@ -5792,7 +5757,7 @@
         </w:tc>
         <w:tc>
           <w:tcPr>
-            <w:tcW w:w="1844" w:type="dxa"/>
+            <w:tcW w:w="1842" w:type="dxa"/>
             <w:tcBorders>
               <w:top w:val="single" w:sz="4" w:space="0" w:color="000000"/>
               <w:start w:val="single" w:sz="4" w:space="0" w:color="000000"/>
@@ -5805,7 +5770,6 @@
             <w:pPr>
               <w:pStyle w:val="Normal"/>
               <w:widowControl w:val="false"/>
-              <w:pBdr/>
               <w:spacing w:before="125" w:after="0"/>
               <w:ind w:firstLine="16"/>
               <w:jc w:val="center"/>
@@ -5828,7 +5792,7 @@
         </w:tc>
         <w:tc>
           <w:tcPr>
-            <w:tcW w:w="1846" w:type="dxa"/>
+            <w:tcW w:w="1848" w:type="dxa"/>
             <w:tcBorders>
               <w:top w:val="single" w:sz="4" w:space="0" w:color="000000"/>
               <w:start w:val="single" w:sz="4" w:space="0" w:color="000000"/>
@@ -5841,7 +5805,6 @@
             <w:pPr>
               <w:pStyle w:val="Normal"/>
               <w:widowControl w:val="false"/>
-              <w:pBdr/>
               <w:spacing w:before="125" w:after="0"/>
               <w:jc w:val="center"/>
               <w:rPr>
@@ -5876,7 +5839,6 @@
             <w:pPr>
               <w:pStyle w:val="Normal"/>
               <w:widowControl w:val="false"/>
-              <w:pBdr/>
               <w:jc w:val="center"/>
               <w:rPr>
                 <w:b/>
@@ -5915,7 +5877,6 @@
             <w:pPr>
               <w:pStyle w:val="Normal"/>
               <w:widowControl w:val="false"/>
-              <w:pBdr/>
               <w:jc w:val="center"/>
               <w:rPr>
                 <w:b/>
@@ -5949,7 +5910,6 @@
             <w:pPr>
               <w:pStyle w:val="Normal"/>
               <w:widowControl w:val="false"/>
-              <w:pBdr/>
               <w:spacing w:lineRule="auto" w:line="252"/>
               <w:jc w:val="center"/>
               <w:rPr>
@@ -5970,7 +5930,7 @@
         </w:tc>
         <w:tc>
           <w:tcPr>
-            <w:tcW w:w="1844" w:type="dxa"/>
+            <w:tcW w:w="1842" w:type="dxa"/>
             <w:tcBorders>
               <w:top w:val="single" w:sz="4" w:space="0" w:color="000000"/>
               <w:start w:val="single" w:sz="4" w:space="0" w:color="000000"/>
@@ -5983,7 +5943,6 @@
             <w:pPr>
               <w:pStyle w:val="Normal"/>
               <w:widowControl w:val="false"/>
-              <w:pBdr/>
               <w:spacing w:before="125" w:after="0"/>
               <w:ind w:firstLine="16"/>
               <w:jc w:val="center"/>
@@ -6005,7 +5964,7 @@
         </w:tc>
         <w:tc>
           <w:tcPr>
-            <w:tcW w:w="1846" w:type="dxa"/>
+            <w:tcW w:w="1848" w:type="dxa"/>
             <w:tcBorders>
               <w:top w:val="single" w:sz="4" w:space="0" w:color="000000"/>
               <w:start w:val="single" w:sz="4" w:space="0" w:color="000000"/>
@@ -6018,7 +5977,6 @@
             <w:pPr>
               <w:pStyle w:val="Normal"/>
               <w:widowControl w:val="false"/>
-              <w:pBdr/>
               <w:spacing w:before="125" w:after="0"/>
               <w:jc w:val="center"/>
               <w:rPr>
@@ -6052,7 +6010,6 @@
             <w:pPr>
               <w:pStyle w:val="Normal"/>
               <w:widowControl w:val="false"/>
-              <w:pBdr/>
               <w:jc w:val="center"/>
               <w:rPr>
                 <w:b/>
@@ -6090,7 +6047,6 @@
             <w:pPr>
               <w:pStyle w:val="Normal"/>
               <w:widowControl w:val="false"/>
-              <w:pBdr/>
               <w:jc w:val="center"/>
               <w:rPr>
                 <w:b/>
@@ -6123,7 +6079,6 @@
             <w:pPr>
               <w:pStyle w:val="Normal"/>
               <w:widowControl w:val="false"/>
-              <w:pBdr/>
               <w:spacing w:lineRule="auto" w:line="252"/>
               <w:jc w:val="center"/>
               <w:rPr>
@@ -6145,7 +6100,7 @@
         </w:tc>
         <w:tc>
           <w:tcPr>
-            <w:tcW w:w="1844" w:type="dxa"/>
+            <w:tcW w:w="1842" w:type="dxa"/>
             <w:tcBorders>
               <w:top w:val="single" w:sz="4" w:space="0" w:color="000000"/>
               <w:start w:val="single" w:sz="4" w:space="0" w:color="000000"/>
@@ -6158,7 +6113,6 @@
             <w:pPr>
               <w:pStyle w:val="Normal"/>
               <w:widowControl w:val="false"/>
-              <w:pBdr/>
               <w:spacing w:before="125" w:after="0"/>
               <w:ind w:firstLine="16"/>
               <w:jc w:val="center"/>
@@ -6181,7 +6135,7 @@
         </w:tc>
         <w:tc>
           <w:tcPr>
-            <w:tcW w:w="1846" w:type="dxa"/>
+            <w:tcW w:w="1848" w:type="dxa"/>
             <w:tcBorders>
               <w:top w:val="single" w:sz="4" w:space="0" w:color="000000"/>
               <w:start w:val="single" w:sz="4" w:space="0" w:color="000000"/>
@@ -6194,7 +6148,6 @@
             <w:pPr>
               <w:pStyle w:val="Normal"/>
               <w:widowControl w:val="false"/>
-              <w:pBdr/>
               <w:spacing w:before="125" w:after="0"/>
               <w:jc w:val="center"/>
               <w:rPr>
@@ -6229,7 +6182,6 @@
             <w:pPr>
               <w:pStyle w:val="Normal"/>
               <w:widowControl w:val="false"/>
-              <w:pBdr/>
               <w:jc w:val="center"/>
               <w:rPr>
                 <w:b/>
@@ -6269,7 +6221,6 @@
             <w:pPr>
               <w:pStyle w:val="Normal"/>
               <w:widowControl w:val="false"/>
-              <w:pBdr/>
               <w:spacing w:lineRule="auto" w:line="233"/>
               <w:ind w:start="3999" w:end="3987"/>
               <w:jc w:val="center"/>
@@ -6309,7 +6260,6 @@
             <w:pPr>
               <w:pStyle w:val="Normal"/>
               <w:widowControl w:val="false"/>
-              <w:pBdr/>
               <w:jc w:val="center"/>
               <w:rPr>
                 <w:b/>
@@ -6342,7 +6292,6 @@
             <w:pPr>
               <w:pStyle w:val="Normal"/>
               <w:widowControl w:val="false"/>
-              <w:pBdr/>
               <w:spacing w:lineRule="auto" w:line="252"/>
               <w:jc w:val="center"/>
               <w:rPr>
@@ -6364,7 +6313,7 @@
         </w:tc>
         <w:tc>
           <w:tcPr>
-            <w:tcW w:w="1844" w:type="dxa"/>
+            <w:tcW w:w="1842" w:type="dxa"/>
             <w:tcBorders>
               <w:top w:val="single" w:sz="4" w:space="0" w:color="000000"/>
               <w:start w:val="single" w:sz="4" w:space="0" w:color="000000"/>
@@ -6377,7 +6326,6 @@
             <w:pPr>
               <w:pStyle w:val="Normal"/>
               <w:widowControl w:val="false"/>
-              <w:pBdr/>
               <w:spacing w:before="125" w:after="0"/>
               <w:ind w:firstLine="16"/>
               <w:jc w:val="center"/>
@@ -6400,7 +6348,7 @@
         </w:tc>
         <w:tc>
           <w:tcPr>
-            <w:tcW w:w="1846" w:type="dxa"/>
+            <w:tcW w:w="1848" w:type="dxa"/>
             <w:tcBorders>
               <w:top w:val="single" w:sz="4" w:space="0" w:color="000000"/>
               <w:start w:val="single" w:sz="4" w:space="0" w:color="000000"/>
@@ -6413,7 +6361,6 @@
             <w:pPr>
               <w:pStyle w:val="Normal"/>
               <w:widowControl w:val="false"/>
-              <w:pBdr/>
               <w:spacing w:before="125" w:after="0"/>
               <w:jc w:val="center"/>
               <w:rPr>
@@ -6448,7 +6395,6 @@
             <w:pPr>
               <w:pStyle w:val="Normal"/>
               <w:widowControl w:val="false"/>
-              <w:pBdr/>
               <w:jc w:val="center"/>
               <w:rPr>
                 <w:b/>
@@ -6477,7 +6423,6 @@
           <w:ilvl w:val="0"/>
           <w:numId w:val="2"/>
         </w:numPr>
-        <w:pBdr/>
         <w:spacing w:before="200" w:after="200"/>
         <w:rPr>
           <w:color w:val="000000"/>
@@ -7670,7 +7615,6 @@
     <w:p>
       <w:pPr>
         <w:pStyle w:val="Normal"/>
-        <w:pBdr/>
         <w:spacing w:lineRule="auto" w:line="276" w:before="200" w:after="200"/>
         <w:rPr>
           <w:b/>
@@ -7681,6 +7625,7 @@
       </w:pPr>
       <w:r>
         <w:rPr>
+          <w:b/>
           <w:color w:val="000000"/>
           <w:sz w:val="22"/>
           <w:szCs w:val="22"/>
@@ -7739,7 +7684,6 @@
     <w:p>
       <w:pPr>
         <w:pStyle w:val="Normal"/>
-        <w:pBdr/>
         <w:jc w:val="both"/>
         <w:rPr>
           <w:sz w:val="22"/>
@@ -7757,7 +7701,6 @@
     <w:p>
       <w:pPr>
         <w:pStyle w:val="Normal"/>
-        <w:pBdr/>
         <w:jc w:val="both"/>
         <w:rPr>
           <w:sz w:val="22"/>
@@ -7769,12 +7712,181 @@
           <w:sz w:val="22"/>
           <w:szCs w:val="22"/>
         </w:rPr>
+      </w:r>
+    </w:p>
+    <w:p>
+      <w:pPr>
+        <w:pStyle w:val="BodyText"/>
+        <w:rPr>
+          <w:rFonts w:ascii="Times New Roman" w:hAnsi="Times New Roman"/>
+        </w:rPr>
+      </w:pPr>
+      <w:r>
+        <w:rPr>
+          <w:rFonts w:ascii="Times New Roman" w:hAnsi="Times New Roman"/>
+        </w:rPr>
+        <w:t>{%p for v in interpretation %}</w:t>
+      </w:r>
+    </w:p>
+    <w:p>
+      <w:pPr>
+        <w:pStyle w:val="BodyText"/>
+        <w:rPr>
+          <w:rFonts w:ascii="Times New Roman" w:hAnsi="Times New Roman"/>
+        </w:rPr>
+      </w:pPr>
+      <w:r>
+        <w:rPr>
+          <w:rFonts w:ascii="Times New Roman" w:hAnsi="Times New Roman"/>
+        </w:rPr>
+        <w:t>{{ v.intro_pre }}</w:t>
+      </w:r>
+      <w:r>
+        <w:rPr>
+          <w:rFonts w:ascii="Times New Roman" w:hAnsi="Times New Roman"/>
+          <w:i/>
+          <w:iCs/>
+        </w:rPr>
+        <w:t>{{ v.gene }}</w:t>
+      </w:r>
+      <w:r>
+        <w:rPr>
+          <w:rFonts w:ascii="Times New Roman" w:hAnsi="Times New Roman"/>
+        </w:rPr>
+        <w:t>{{ v.intro_post }}</w:t>
+      </w:r>
+    </w:p>
+    <w:p>
+      <w:pPr>
+        <w:pStyle w:val="BodyText"/>
+        <w:rPr>
+          <w:rFonts w:ascii="Times New Roman" w:hAnsi="Times New Roman"/>
+        </w:rPr>
+      </w:pPr>
+      <w:r>
+        <w:rPr>
+          <w:rFonts w:ascii="Times New Roman" w:hAnsi="Times New Roman"/>
+        </w:rPr>
+        <w:t>{%p if v.omim_pre %}</w:t>
+      </w:r>
+    </w:p>
+    <w:p>
+      <w:pPr>
+        <w:pStyle w:val="BodyText"/>
+        <w:rPr>
+          <w:rFonts w:ascii="Times New Roman" w:hAnsi="Times New Roman"/>
+        </w:rPr>
+      </w:pPr>
+      <w:r>
+        <w:rPr>
+          <w:rFonts w:ascii="Times New Roman" w:hAnsi="Times New Roman"/>
+        </w:rPr>
+        <w:t>{{ v.omim_pre }}</w:t>
+      </w:r>
+      <w:r>
+        <w:rPr>
+          <w:rFonts w:ascii="Times New Roman" w:hAnsi="Times New Roman"/>
+          <w:i/>
+          <w:iCs/>
+        </w:rPr>
+        <w:t>{{ v.gene }}</w:t>
+      </w:r>
+      <w:r>
+        <w:rPr>
+          <w:rFonts w:ascii="Times New Roman" w:hAnsi="Times New Roman"/>
+        </w:rPr>
+        <w:t>{{ v.omim_post }}</w:t>
+      </w:r>
+    </w:p>
+    <w:p>
+      <w:pPr>
+        <w:pStyle w:val="BodyText"/>
+        <w:rPr>
+          <w:rFonts w:ascii="Times New Roman" w:hAnsi="Times New Roman"/>
+        </w:rPr>
+      </w:pPr>
+      <w:r>
+        <w:rPr>
+          <w:rFonts w:ascii="Times New Roman" w:hAnsi="Times New Roman"/>
+        </w:rPr>
+        <w:t>{%p endif %}</w:t>
+      </w:r>
+    </w:p>
+    <w:p>
+      <w:pPr>
+        <w:pStyle w:val="BodyText"/>
+        <w:rPr>
+          <w:rFonts w:ascii="Times New Roman" w:hAnsi="Times New Roman"/>
+        </w:rPr>
+      </w:pPr>
+      <w:r>
+        <w:rPr>
+          <w:rFonts w:ascii="Times New Roman" w:hAnsi="Times New Roman"/>
+        </w:rPr>
+        <w:t>{%p for para in v.body %}</w:t>
+      </w:r>
+    </w:p>
+    <w:p>
+      <w:pPr>
+        <w:pStyle w:val="BodyText"/>
+        <w:rPr>
+          <w:rFonts w:ascii="Times New Roman" w:hAnsi="Times New Roman"/>
+        </w:rPr>
+      </w:pPr>
+      <w:r>
+        <w:rPr>
+          <w:rFonts w:ascii="Times New Roman" w:hAnsi="Times New Roman"/>
+        </w:rPr>
+        <w:t>{{ para }}</w:t>
+      </w:r>
+    </w:p>
+    <w:p>
+      <w:pPr>
+        <w:pStyle w:val="BodyText"/>
+        <w:rPr>
+          <w:rFonts w:ascii="Times New Roman" w:hAnsi="Times New Roman"/>
+        </w:rPr>
+      </w:pPr>
+      <w:r>
+        <w:rPr>
+          <w:rFonts w:ascii="Times New Roman" w:hAnsi="Times New Roman"/>
+        </w:rPr>
+        <w:t>{%p endfor %}</w:t>
+      </w:r>
+    </w:p>
+    <w:p>
+      <w:pPr>
+        <w:pStyle w:val="BodyText"/>
+        <w:rPr>
+          <w:rFonts w:ascii="Times New Roman" w:hAnsi="Times New Roman"/>
+        </w:rPr>
+      </w:pPr>
+      <w:r>
+        <w:rPr>
+          <w:rFonts w:ascii="Times New Roman" w:hAnsi="Times New Roman"/>
+        </w:rPr>
+        <w:t>{%p endfor %}</w:t>
+      </w:r>
+    </w:p>
+    <w:p>
+      <w:pPr>
+        <w:pStyle w:val="BodyText"/>
+        <w:rPr>
+          <w:rFonts w:ascii="Times New Roman" w:hAnsi="Times New Roman"/>
+        </w:rPr>
+      </w:pPr>
+      <w:r>
+        <w:rPr>
+          <w:rFonts w:ascii="Times New Roman" w:hAnsi="Times New Roman"/>
+          <w:sz w:val="22"/>
+          <w:szCs w:val="22"/>
+        </w:rPr>
+        <w:t>{{ closing }}</w:t>
       </w:r>
     </w:p>
     <w:p>
       <w:pPr>
         <w:pStyle w:val="Normal"/>
-        <w:pBdr/>
         <w:jc w:val="both"/>
         <w:rPr>
           <w:sz w:val="22"/>
@@ -7786,30 +7898,11 @@
           <w:sz w:val="22"/>
           <w:szCs w:val="22"/>
         </w:rPr>
-        <w:t xml:space="preserve">Других значимых изменений, соответствующих критериям поиска, не обнаружено. </w:t>
       </w:r>
     </w:p>
     <w:p>
       <w:pPr>
         <w:pStyle w:val="Normal"/>
-        <w:pBdr/>
-        <w:jc w:val="both"/>
-        <w:rPr>
-          <w:sz w:val="22"/>
-          <w:szCs w:val="22"/>
-        </w:rPr>
-      </w:pPr>
-      <w:r>
-        <w:rPr>
-          <w:sz w:val="22"/>
-          <w:szCs w:val="22"/>
-        </w:rPr>
-      </w:r>
-    </w:p>
-    <w:p>
-      <w:pPr>
-        <w:pStyle w:val="Normal"/>
-        <w:pBdr/>
         <w:jc w:val="both"/>
         <w:rPr>
           <w:sz w:val="22"/>
@@ -7827,7 +7920,6 @@
     <w:p>
       <w:pPr>
         <w:pStyle w:val="Normal"/>
-        <w:pBdr/>
         <w:jc w:val="both"/>
         <w:rPr>
           <w:sz w:val="22"/>
@@ -7844,7 +7936,6 @@
     <w:p>
       <w:pPr>
         <w:pStyle w:val="Normal"/>
-        <w:pBdr/>
         <w:jc w:val="both"/>
         <w:rPr>
           <w:sz w:val="22"/>
@@ -7929,8 +8020,8 @@
         <w:tblLook w:noHBand="0" w:noVBand="1" w:firstColumn="0" w:lastRow="0" w:lastColumn="0" w:firstRow="0" w:val="0400"/>
       </w:tblPr>
       <w:tblGrid>
-        <w:gridCol w:w="2943"/>
-        <w:gridCol w:w="6779"/>
+        <w:gridCol w:w="2941"/>
+        <w:gridCol w:w="6781"/>
       </w:tblGrid>
       <w:tr>
         <w:trPr>
@@ -7938,7 +8029,7 @@
         </w:trPr>
         <w:tc>
           <w:tcPr>
-            <w:tcW w:w="2943" w:type="dxa"/>
+            <w:tcW w:w="2941" w:type="dxa"/>
             <w:tcBorders>
               <w:top w:val="single" w:sz="4" w:space="0" w:color="000000"/>
               <w:start w:val="single" w:sz="4" w:space="0" w:color="000000"/>
@@ -7967,7 +8058,7 @@
         </w:tc>
         <w:tc>
           <w:tcPr>
-            <w:tcW w:w="6779" w:type="dxa"/>
+            <w:tcW w:w="6781" w:type="dxa"/>
             <w:tcBorders>
               <w:top w:val="single" w:sz="4" w:space="0" w:color="000000"/>
               <w:start w:val="single" w:sz="4" w:space="0" w:color="000000"/>
@@ -8003,7 +8094,7 @@
         </w:trPr>
         <w:tc>
           <w:tcPr>
-            <w:tcW w:w="2943" w:type="dxa"/>
+            <w:tcW w:w="2941" w:type="dxa"/>
             <w:tcBorders>
               <w:top w:val="single" w:sz="4" w:space="0" w:color="000000"/>
               <w:start w:val="single" w:sz="4" w:space="0" w:color="000000"/>
@@ -8032,7 +8123,7 @@
         </w:tc>
         <w:tc>
           <w:tcPr>
-            <w:tcW w:w="6779" w:type="dxa"/>
+            <w:tcW w:w="6781" w:type="dxa"/>
             <w:tcBorders>
               <w:top w:val="single" w:sz="4" w:space="0" w:color="000000"/>
               <w:start w:val="single" w:sz="4" w:space="0" w:color="000000"/>
@@ -8065,7 +8156,7 @@
         </w:trPr>
         <w:tc>
           <w:tcPr>
-            <w:tcW w:w="2943" w:type="dxa"/>
+            <w:tcW w:w="2941" w:type="dxa"/>
             <w:tcBorders>
               <w:top w:val="single" w:sz="4" w:space="0" w:color="000000"/>
               <w:start w:val="single" w:sz="4" w:space="0" w:color="000000"/>
@@ -8094,7 +8185,7 @@
         </w:tc>
         <w:tc>
           <w:tcPr>
-            <w:tcW w:w="6779" w:type="dxa"/>
+            <w:tcW w:w="6781" w:type="dxa"/>
             <w:tcBorders>
               <w:top w:val="single" w:sz="4" w:space="0" w:color="000000"/>
               <w:start w:val="single" w:sz="4" w:space="0" w:color="000000"/>
@@ -8128,7 +8219,7 @@
         </w:trPr>
         <w:tc>
           <w:tcPr>
-            <w:tcW w:w="2943" w:type="dxa"/>
+            <w:tcW w:w="2941" w:type="dxa"/>
             <w:tcBorders>
               <w:top w:val="single" w:sz="4" w:space="0" w:color="000000"/>
               <w:start w:val="single" w:sz="4" w:space="0" w:color="000000"/>
@@ -8157,7 +8248,7 @@
         </w:tc>
         <w:tc>
           <w:tcPr>
-            <w:tcW w:w="6779" w:type="dxa"/>
+            <w:tcW w:w="6781" w:type="dxa"/>
             <w:tcBorders>
               <w:top w:val="single" w:sz="4" w:space="0" w:color="000000"/>
               <w:start w:val="single" w:sz="4" w:space="0" w:color="000000"/>
@@ -8191,7 +8282,7 @@
         </w:trPr>
         <w:tc>
           <w:tcPr>
-            <w:tcW w:w="2943" w:type="dxa"/>
+            <w:tcW w:w="2941" w:type="dxa"/>
             <w:tcBorders>
               <w:top w:val="single" w:sz="4" w:space="0" w:color="000000"/>
               <w:start w:val="single" w:sz="4" w:space="0" w:color="000000"/>
@@ -8220,7 +8311,7 @@
         </w:tc>
         <w:tc>
           <w:tcPr>
-            <w:tcW w:w="6779" w:type="dxa"/>
+            <w:tcW w:w="6781" w:type="dxa"/>
             <w:tcBorders>
               <w:top w:val="single" w:sz="4" w:space="0" w:color="000000"/>
               <w:start w:val="single" w:sz="4" w:space="0" w:color="000000"/>
@@ -8254,7 +8345,7 @@
         </w:trPr>
         <w:tc>
           <w:tcPr>
-            <w:tcW w:w="2943" w:type="dxa"/>
+            <w:tcW w:w="2941" w:type="dxa"/>
             <w:vMerge w:val="restart"/>
             <w:tcBorders>
               <w:top w:val="single" w:sz="4" w:space="0" w:color="000000"/>
@@ -8284,7 +8375,7 @@
         </w:tc>
         <w:tc>
           <w:tcPr>
-            <w:tcW w:w="6779" w:type="dxa"/>
+            <w:tcW w:w="6781" w:type="dxa"/>
             <w:tcBorders>
               <w:top w:val="single" w:sz="4" w:space="0" w:color="000000"/>
               <w:start w:val="single" w:sz="4" w:space="0" w:color="000000"/>
@@ -8318,7 +8409,7 @@
         </w:trPr>
         <w:tc>
           <w:tcPr>
-            <w:tcW w:w="2943" w:type="dxa"/>
+            <w:tcW w:w="2941" w:type="dxa"/>
             <w:vMerge w:val="continue"/>
             <w:tcBorders>
               <w:top w:val="single" w:sz="4" w:space="0" w:color="000000"/>
@@ -8331,7 +8422,6 @@
             <w:pPr>
               <w:pStyle w:val="Normal"/>
               <w:widowControl w:val="false"/>
-              <w:pBdr/>
               <w:spacing w:lineRule="auto" w:line="276"/>
               <w:rPr>
                 <w:sz w:val="22"/>
@@ -8348,7 +8438,7 @@
         </w:tc>
         <w:tc>
           <w:tcPr>
-            <w:tcW w:w="6779" w:type="dxa"/>
+            <w:tcW w:w="6781" w:type="dxa"/>
             <w:tcBorders>
               <w:top w:val="single" w:sz="4" w:space="0" w:color="000000"/>
               <w:start w:val="single" w:sz="4" w:space="0" w:color="000000"/>
@@ -9574,6 +9664,7 @@
     <w:rsid w:val="00336e36"/>
     <w:pPr>
       <w:widowControl/>
+      <w:suppressAutoHyphens w:val="true"/>
       <w:bidi w:val="0"/>
       <w:spacing w:lineRule="auto" w:line="240" w:before="0" w:after="0"/>
       <w:jc w:val="start"/>
@@ -9640,6 +9731,7 @@
       <w:keepNext w:val="true"/>
       <w:keepLines/>
       <w:widowControl/>
+      <w:suppressAutoHyphens w:val="true"/>
       <w:bidi w:val="0"/>
       <w:spacing w:lineRule="auto" w:line="259" w:before="0" w:after="17"/>
       <w:ind w:hanging="10" w:start="369"/>
@@ -9976,12 +10068,13 @@
     <w:rsid w:val="00532df3"/>
     <w:pPr>
       <w:widowControl w:val="false"/>
+      <w:suppressAutoHyphens w:val="true"/>
       <w:bidi w:val="0"/>
       <w:spacing w:lineRule="auto" w:line="240" w:before="0" w:after="0"/>
       <w:jc w:val="start"/>
     </w:pPr>
     <w:rPr>
-      <w:rFonts w:eastAsia="Times New Roman" w:ascii="Calibri" w:hAnsi="Calibri" w:cs="Calibri"/>
+      <w:rFonts w:ascii="Calibri" w:hAnsi="Calibri" w:eastAsia="Times New Roman" w:cs="Calibri"/>
       <w:color w:val="auto"/>
       <w:kern w:val="0"/>
       <w:sz w:val="22"/>
@@ -9995,6 +10088,7 @@
     <w:rsid w:val="00532df3"/>
     <w:pPr>
       <w:widowControl w:val="false"/>
+      <w:suppressAutoHyphens w:val="true"/>
       <w:bidi w:val="0"/>
       <w:spacing w:lineRule="auto" w:line="240" w:before="0" w:after="0"/>
       <w:jc w:val="start"/>
@@ -10110,6 +10204,7 @@
     <w:rsid w:val="005e4ad5"/>
     <w:pPr>
       <w:widowControl/>
+      <w:suppressAutoHyphens w:val="true"/>
       <w:bidi w:val="0"/>
       <w:spacing w:lineRule="auto" w:line="276" w:before="120" w:after="120"/>
       <w:jc w:val="both"/>
@@ -10167,6 +10262,7 @@
     <w:rsid w:val="001b7d2e"/>
     <w:pPr>
       <w:widowControl/>
+      <w:suppressAutoHyphens w:val="true"/>
       <w:bidi w:val="0"/>
       <w:spacing w:lineRule="auto" w:line="240" w:before="0" w:after="0"/>
       <w:jc w:val="start"/>

</xml_diff>